<commit_message>
Sync SnowLotus-CellFM editor-v0.3 status panel fix
</commit_message>
<xml_diff>
--- a/manuscript/SnowLotus_CellFM_editor_submission_v0_2.docx
+++ b/manuscript/SnowLotus_CellFM_editor_submission_v0_2.docx
@@ -17,7 +17,7 @@
         <w:pStyle w:val="FirstParagraph"/>
       </w:pPr>
       <w:r>
-        <w:t xml:space="preserve">Editor-facing manuscript draft v0.3, generated 2026-07-26 01:18 UTC</w:t>
+        <w:t xml:space="preserve">Editor-facing manuscript draft v0.3, generated 2026-07-26 01:52 UTC</w:t>
       </w:r>
     </w:p>
     <w:p>
@@ -324,7 +324,7 @@
         <w:t xml:space="preserve">00c1b0a1049c441585ecd7ee03e81d05704bd93100c692cc06f7bdc90f2c034a</w:t>
       </w:r>
       <w:r>
-        <w:t xml:space="preserve">. Training remains active in epoch 8, at step 15500 of 56022 batches per epoch at the time of this manuscript refresh. The package freezes the best audited checkpoint rather than the most recent in-progress state, so the submitted model asset is reproducible even while background training continues.</w:t>
+        <w:t xml:space="preserve">. Training remains active in epoch 8, at step 31750 of 56022 batches per epoch at the time of this manuscript refresh. The package freezes the best audited checkpoint rather than the most recent in-progress state, so the submitted model asset is reproducible even while background training continues.</w:t>
       </w:r>
     </w:p>
     <w:p>

</xml_diff>

<commit_message>
Sync SnowLotus-CellFM GSE155304 plus-corpus release metadata
</commit_message>
<xml_diff>
--- a/manuscript/SnowLotus_CellFM_editor_submission_v0_2.docx
+++ b/manuscript/SnowLotus_CellFM_editor_submission_v0_2.docx
@@ -17,7 +17,7 @@
         <w:pStyle w:val="FirstParagraph"/>
       </w:pPr>
       <w:r>
-        <w:t xml:space="preserve">Editor-facing manuscript draft v0.3, generated 2026-07-26 01:52 UTC</w:t>
+        <w:t xml:space="preserve">Editor-facing manuscript draft v0.3, generated 2026-07-26 03:03 UTC</w:t>
       </w:r>
     </w:p>
     <w:p>
@@ -50,7 +50,7 @@
         <w:t xml:space="preserve"> </w:t>
       </w:r>
       <w:r>
-        <w:t xml:space="preserve">(Snow Lotus), where transcriptomic and genomic evidence is available but a reusable public single-cell expression matrix has not yet been identified in the current audit. Here we present SnowLotus-CellFM, an audited plant expression foundation-model scaffold for cross-species cell-state representation and target-species transfer. The current editor snapshot audits 68 manifest files, 209 readable matrix files and 4,054,536 referenced cells, with 0 missing and 0 unreadable matrices. The package separates usable expression matrices from inaccessible, incompatible or oversized records, including large GEO RAW archives that require file-level retrieval rather than whole-tar downloading. SnowLotus-CellFM uses transformer-based masked gene modelling over normalized public plant expression matrices, with gene tokens, expression-value bins and sample-level metadata. The frozen embedding asset for this submission is the current v0.3 checkpoint at epoch 7, with validation eval loss 7.1917 and SHA256</w:t>
+        <w:t xml:space="preserve">(Snow Lotus), where transcriptomic and genomic evidence is available but a reusable public single-cell expression matrix has not yet been identified in the current audit. Here we present SnowLotus-CellFM, an audited plant expression foundation-model scaffold for cross-species cell-state representation and target-species transfer. The current editor snapshot audits 69 manifest files, 210 readable matrix files and 4,072,521 referenced cells, with 0 missing and 0 unreadable matrices. The package separates usable expression matrices from inaccessible, incompatible or oversized records, including large GEO RAW archives that require file-level retrieval rather than whole-tar downloading. SnowLotus-CellFM uses transformer-based masked gene modelling over normalized public plant expression matrices, with gene tokens, expression-value bins and sample-level metadata. The frozen embedding asset for this submission is the current v0.3 checkpoint at epoch 7, with validation eval loss 7.1917 and SHA256</w:t>
       </w:r>
       <w:r>
         <w:t xml:space="preserve"> </w:t>
@@ -177,7 +177,7 @@
         <w:pStyle w:val="FirstParagraph"/>
       </w:pPr>
       <w:r>
-        <w:t xml:space="preserve">The current editor package audits 68 manifest files and 209 referenced matrix files. All audited manifests are marked ready, with 0 missing files and 0 unreadable matrix files in the current integrity report. Across readable matrices, the package records 4,054,536 referenced cells. The corpus includes established plant systems such as</w:t>
+        <w:t xml:space="preserve">The current editor package audits 69 manifest files and 210 referenced matrix files. All audited manifests are marked ready, with 0 missing files and 0 unreadable matrix files in the current integrity report. Across readable matrices, the package records 4,072,521 referenced cells. The corpus includes established plant systems such as</w:t>
       </w:r>
       <w:r>
         <w:t xml:space="preserve"> </w:t>
@@ -324,7 +324,7 @@
         <w:t xml:space="preserve">00c1b0a1049c441585ecd7ee03e81d05704bd93100c692cc06f7bdc90f2c034a</w:t>
       </w:r>
       <w:r>
-        <w:t xml:space="preserve">. Training remains active in epoch 8, at step 31750 of 56022 batches per epoch at the time of this manuscript refresh. The package freezes the best audited checkpoint rather than the most recent in-progress state, so the submitted model asset is reproducible even while background training continues.</w:t>
+        <w:t xml:space="preserve">. Training remains active in epoch 9, at step 14000 of 56022 batches per epoch at the time of this manuscript refresh. The package freezes the best audited checkpoint rather than the most recent in-progress state, so the submitted model asset is reproducible even while background training continues.</w:t>
       </w:r>
     </w:p>
     <w:p>

</xml_diff>

<commit_message>
Sync SnowLotus-CellFM editor-v0.3 release b7cfcf8
</commit_message>
<xml_diff>
--- a/manuscript/SnowLotus_CellFM_editor_submission_v0_2.docx
+++ b/manuscript/SnowLotus_CellFM_editor_submission_v0_2.docx
@@ -17,7 +17,7 @@
         <w:pStyle w:val="FirstParagraph"/>
       </w:pPr>
       <w:r>
-        <w:t xml:space="preserve">Editor-facing manuscript draft v0.3, generated 2026-07-26 03:03 UTC</w:t>
+        <w:t xml:space="preserve">Editor-facing manuscript draft v0.3, generated 2026-07-26 03:38 UTC</w:t>
       </w:r>
     </w:p>
     <w:p>
@@ -50,7 +50,7 @@
         <w:t xml:space="preserve"> </w:t>
       </w:r>
       <w:r>
-        <w:t xml:space="preserve">(Snow Lotus), where transcriptomic and genomic evidence is available but a reusable public single-cell expression matrix has not yet been identified in the current audit. Here we present SnowLotus-CellFM, an audited plant expression foundation-model scaffold for cross-species cell-state representation and target-species transfer. The current editor snapshot audits 69 manifest files, 210 readable matrix files and 4,072,521 referenced cells, with 0 missing and 0 unreadable matrices. The package separates usable expression matrices from inaccessible, incompatible or oversized records, including large GEO RAW archives that require file-level retrieval rather than whole-tar downloading. SnowLotus-CellFM uses transformer-based masked gene modelling over normalized public plant expression matrices, with gene tokens, expression-value bins and sample-level metadata. The frozen embedding asset for this submission is the current v0.3 checkpoint at epoch 7, with validation eval loss 7.1917 and SHA256</w:t>
+        <w:t xml:space="preserve">(Snow Lotus), where transcriptomic and genomic evidence is available but a reusable public single-cell expression matrix has not yet been identified in the current audit. Here we present SnowLotus-CellFM, an audited plant expression foundation-model scaffold for cross-species cell-state representation and target-species transfer. The current editor snapshot audits 70 manifest files, 240 readable matrix files and 4,544,570 referenced cells, with 0 missing and 0 unreadable matrices. The package separates usable expression matrices from inaccessible, incompatible or oversized records, including large GEO RAW archives that require file-level retrieval rather than whole-tar downloading. SnowLotus-CellFM uses transformer-based masked gene modelling over normalized public plant expression matrices, with gene tokens, expression-value bins and sample-level metadata. The frozen embedding asset for this submission is the current v0.3 checkpoint at epoch 7, with validation eval loss 7.1917 and SHA256</w:t>
       </w:r>
       <w:r>
         <w:t xml:space="preserve"> </w:t>
@@ -177,7 +177,7 @@
         <w:pStyle w:val="FirstParagraph"/>
       </w:pPr>
       <w:r>
-        <w:t xml:space="preserve">The current editor package audits 69 manifest files and 210 referenced matrix files. All audited manifests are marked ready, with 0 missing files and 0 unreadable matrix files in the current integrity report. Across readable matrices, the package records 4,072,521 referenced cells. The corpus includes established plant systems such as</w:t>
+        <w:t xml:space="preserve">The current editor package audits 70 manifest files and 240 referenced matrix files. All audited manifests are marked ready, with 0 missing files and 0 unreadable matrix files in the current integrity report. Across readable matrices, the package records 4,544,570 referenced cells. The corpus includes established plant systems such as</w:t>
       </w:r>
       <w:r>
         <w:t xml:space="preserve"> </w:t>
@@ -324,7 +324,7 @@
         <w:t xml:space="preserve">00c1b0a1049c441585ecd7ee03e81d05704bd93100c692cc06f7bdc90f2c034a</w:t>
       </w:r>
       <w:r>
-        <w:t xml:space="preserve">. Training remains active in epoch 9, at step 14000 of 56022 batches per epoch at the time of this manuscript refresh. The package freezes the best audited checkpoint rather than the most recent in-progress state, so the submitted model asset is reproducible even while background training continues.</w:t>
+        <w:t xml:space="preserve">. Training remains active in epoch 9, at step 32250 of 56022 batches per epoch at the time of this manuscript refresh. The package freezes the best audited checkpoint rather than the most recent in-progress state, so the submitted model asset is reproducible even while background training continues.</w:t>
       </w:r>
     </w:p>
     <w:p>

</xml_diff>